<commit_message>
Add minimal dashboard entrypoint and tests
</commit_message>
<xml_diff>
--- a/Development.docx
+++ b/Development.docx
@@ -4,6 +4,9 @@
   <w:body>
     <w:p>
       <w:r>
+        <w:rPr>
+          <w:noProof/>
+        </w:rPr>
         <w:drawing>
           <wp:inline distT="0" distB="0" distL="0" distR="0" wp14:anchorId="242A4DBA" wp14:editId="543D88F2">
             <wp:extent cx="5943600" cy="8004175"/>
@@ -481,8 +484,13 @@
     </w:p>
     <w:p/>
     <w:p>
-      <w:r>
-        <w:t>canonical prices</w:t>
+      <w:proofErr w:type="gramStart"/>
+      <w:r>
+        <w:t>canonical</w:t>
+      </w:r>
+      <w:proofErr w:type="gramEnd"/>
+      <w:r>
+        <w:t xml:space="preserve"> prices</w:t>
       </w:r>
     </w:p>
     <w:p>
@@ -493,9 +501,14 @@
     <w:p>
       <w:proofErr w:type="spellStart"/>
       <w:r>
-        <w:t>price_returns.parquet</w:t>
+        <w:t>price_</w:t>
+      </w:r>
+      <w:proofErr w:type="gramStart"/>
+      <w:r>
+        <w:t>returns.parquet</w:t>
       </w:r>
       <w:proofErr w:type="spellEnd"/>
+      <w:proofErr w:type="gramEnd"/>
     </w:p>
     <w:p>
       <w:r>
@@ -505,8 +518,13 @@
     <w:p>
       <w:r>
         <w:lastRenderedPageBreak/>
-        <w:t>optimiser_regime_quant_v1.parquet</w:t>
-      </w:r>
+        <w:t>optimiser_regime_quant_v</w:t>
+      </w:r>
+      <w:proofErr w:type="gramStart"/>
+      <w:r>
+        <w:t>1.parquet</w:t>
+      </w:r>
+      <w:proofErr w:type="gramEnd"/>
     </w:p>
     <w:p>
       <w:r>
@@ -515,7 +533,15 @@
     </w:p>
     <w:p>
       <w:r>
-        <w:t>expected_returns_quant_v1.parquet   ← THIS is the missing link</w:t>
+        <w:t>expected_returns_quant_v</w:t>
+      </w:r>
+      <w:proofErr w:type="gramStart"/>
+      <w:r>
+        <w:t>1.parquet</w:t>
+      </w:r>
+      <w:proofErr w:type="gramEnd"/>
+      <w:r>
+        <w:t xml:space="preserve">   ← THIS is the missing link</w:t>
       </w:r>
     </w:p>
     <w:p>
@@ -535,8 +561,13 @@
     </w:p>
     <w:p>
       <w:r>
-        <w:t>portfolio_quant_v2.parquet</w:t>
-      </w:r>
+        <w:t>portfolio_quant_v</w:t>
+      </w:r>
+      <w:proofErr w:type="gramStart"/>
+      <w:r>
+        <w:t>2.parquet</w:t>
+      </w:r>
+      <w:proofErr w:type="gramEnd"/>
     </w:p>
     <w:p>
       <w:r>
@@ -545,8 +576,13 @@
     </w:p>
     <w:p>
       <w:r>
-        <w:t>attribution_quant_v2.parquet</w:t>
-      </w:r>
+        <w:t>attribution_quant_v</w:t>
+      </w:r>
+      <w:proofErr w:type="gramStart"/>
+      <w:r>
+        <w:t>2.parquet</w:t>
+      </w:r>
+      <w:proofErr w:type="gramEnd"/>
     </w:p>
     <w:p>
       <w:r>
@@ -555,8 +591,13 @@
     </w:p>
     <w:p>
       <w:r>
-        <w:t>weekly_picks_quant_v1.parquet</w:t>
-      </w:r>
+        <w:t>weekly_picks_quant_v</w:t>
+      </w:r>
+      <w:proofErr w:type="gramStart"/>
+      <w:r>
+        <w:t>1.parquet</w:t>
+      </w:r>
+      <w:proofErr w:type="gramEnd"/>
     </w:p>
     <w:p>
       <w:r>
@@ -578,8 +619,17 @@
           <w:b/>
           <w:bCs/>
         </w:rPr>
-        <w:t>Validation Summary for optimiser_regime_quant_v1.parquet</w:t>
-      </w:r>
+        <w:t>Validation Summary for optimiser_regime_quant_v</w:t>
+      </w:r>
+      <w:proofErr w:type="gramStart"/>
+      <w:r>
+        <w:rPr>
+          <w:b/>
+          <w:bCs/>
+        </w:rPr>
+        <w:t>1.parquet</w:t>
+      </w:r>
+      <w:proofErr w:type="gramEnd"/>
     </w:p>
     <w:p>
       <w:r>
@@ -591,7 +641,23 @@
       </w:r>
       <w:r>
         <w:noBreakHyphen/>
-        <w:t xml:space="preserve">end validation performed on the file optimiser_regime_quant_v1.parquet. The goal of the validation was to confirm that the dataset is structurally sound, mathematically correct, internally consistent, and suitable for downstream use in regime analysis, </w:t>
+        <w:t xml:space="preserve">end validation performed on </w:t>
+      </w:r>
+      <w:proofErr w:type="gramStart"/>
+      <w:r>
+        <w:t>the file</w:t>
+      </w:r>
+      <w:proofErr w:type="gramEnd"/>
+      <w:r>
+        <w:t xml:space="preserve"> optimiser_regime_quant_v</w:t>
+      </w:r>
+      <w:proofErr w:type="gramStart"/>
+      <w:r>
+        <w:t>1.parquet</w:t>
+      </w:r>
+      <w:proofErr w:type="gramEnd"/>
+      <w:r>
+        <w:t xml:space="preserve">. The goal of the validation was to confirm that the dataset is structurally sound, mathematically correct, internally consistent, and suitable for downstream use in regime analysis, </w:t>
       </w:r>
       <w:proofErr w:type="spellStart"/>
       <w:r>
@@ -666,8 +732,17 @@
           <w:b/>
           <w:bCs/>
         </w:rPr>
-        <w:t>515 tickers</w:t>
-      </w:r>
+        <w:t xml:space="preserve">515 </w:t>
+      </w:r>
+      <w:proofErr w:type="gramStart"/>
+      <w:r>
+        <w:rPr>
+          <w:b/>
+          <w:bCs/>
+        </w:rPr>
+        <w:t>tickers</w:t>
+      </w:r>
+      <w:proofErr w:type="gramEnd"/>
       <w:r>
         <w:t xml:space="preserve"> and </w:t>
       </w:r>
@@ -999,11 +1074,13 @@
       </w:r>
     </w:p>
     <w:p>
+      <w:proofErr w:type="gramStart"/>
       <w:r>
         <w:lastRenderedPageBreak/>
         <w:t>max(abs(</w:t>
       </w:r>
       <w:proofErr w:type="spellStart"/>
+      <w:proofErr w:type="gramEnd"/>
       <w:r>
         <w:t>computed_ret</w:t>
       </w:r>
@@ -1043,10 +1120,12 @@
       </w:r>
     </w:p>
     <w:p>
+      <w:proofErr w:type="gramStart"/>
       <w:r>
         <w:t>max(abs(</w:t>
       </w:r>
       <w:proofErr w:type="spellStart"/>
+      <w:proofErr w:type="gramEnd"/>
       <w:r>
         <w:t>computed_log_ret</w:t>
       </w:r>
@@ -1314,8 +1393,13 @@
         </w:numPr>
       </w:pPr>
       <w:r>
-        <w:t>Broken return logic</w:t>
-      </w:r>
+        <w:t xml:space="preserve">Broken </w:t>
+      </w:r>
+      <w:proofErr w:type="gramStart"/>
+      <w:r>
+        <w:t>return logic</w:t>
+      </w:r>
+      <w:proofErr w:type="gramEnd"/>
     </w:p>
     <w:p>
       <w:pPr>
@@ -1329,16 +1413,33 @@
       </w:r>
     </w:p>
     <w:p>
-      <w:r>
-        <w:rPr>
-          <w:b/>
-          <w:bCs/>
-        </w:rPr>
-        <w:t>Final Conclusion:</w:t>
+      <w:proofErr w:type="gramStart"/>
+      <w:r>
+        <w:rPr>
+          <w:b/>
+          <w:bCs/>
+        </w:rPr>
+        <w:t>Final Conclusion</w:t>
+      </w:r>
+      <w:proofErr w:type="gramEnd"/>
+      <w:r>
+        <w:rPr>
+          <w:b/>
+          <w:bCs/>
+        </w:rPr>
+        <w:t>:</w:t>
       </w:r>
       <w:r>
         <w:br/>
-        <w:t>optimiser_regime_quant_v1.parquet is a fully verified, production</w:t>
+        <w:t>optimiser_regime_quant_v</w:t>
+      </w:r>
+      <w:proofErr w:type="gramStart"/>
+      <w:r>
+        <w:t>1.parquet</w:t>
+      </w:r>
+      <w:proofErr w:type="gramEnd"/>
+      <w:r>
+        <w:t xml:space="preserve"> is a fully verified, production</w:t>
       </w:r>
       <w:r>
         <w:noBreakHyphen/>
@@ -1370,7 +1471,15 @@
     </w:p>
     <w:p>
       <w:r>
-        <w:t>optimiser_regime_quant_v1.parquet is a fully rectangular, feature</w:t>
+        <w:t>optimiser_regime_quant_v</w:t>
+      </w:r>
+      <w:proofErr w:type="gramStart"/>
+      <w:r>
+        <w:t>1.parquet</w:t>
+      </w:r>
+      <w:proofErr w:type="gramEnd"/>
+      <w:r>
+        <w:t xml:space="preserve"> is a fully rectangular, feature</w:t>
       </w:r>
       <w:r>
         <w:noBreakHyphen/>
@@ -1602,6 +1711,9 @@
     <w:p/>
     <w:p>
       <w:r>
+        <w:rPr>
+          <w:noProof/>
+        </w:rPr>
         <w:lastRenderedPageBreak/>
         <w:drawing>
           <wp:inline distT="0" distB="0" distL="0" distR="0" wp14:anchorId="22A6173F" wp14:editId="1CAECE0B">
@@ -1680,8 +1792,13 @@
         <w:t>sma200</w:t>
       </w:r>
       <w:r>
-        <w:t xml:space="preserve"> missing for first 200 days per ticker</w:t>
-      </w:r>
+        <w:t xml:space="preserve"> missing for first 200 days per </w:t>
+      </w:r>
+      <w:proofErr w:type="gramStart"/>
+      <w:r>
+        <w:t>ticker</w:t>
+      </w:r>
+      <w:proofErr w:type="gramEnd"/>
     </w:p>
     <w:p>
       <w:pPr>
@@ -2203,12 +2320,21 @@
       <w:r>
         <w:t xml:space="preserve">A </w:t>
       </w:r>
-      <w:r>
-        <w:rPr>
-          <w:b/>
-          <w:bCs/>
-        </w:rPr>
-        <w:t>versioned data contract</w:t>
+      <w:proofErr w:type="gramStart"/>
+      <w:r>
+        <w:rPr>
+          <w:b/>
+          <w:bCs/>
+        </w:rPr>
+        <w:t>versioned</w:t>
+      </w:r>
+      <w:proofErr w:type="gramEnd"/>
+      <w:r>
+        <w:rPr>
+          <w:b/>
+          <w:bCs/>
+        </w:rPr>
+        <w:t xml:space="preserve"> data contract</w:t>
       </w:r>
       <w:r>
         <w:t xml:space="preserve"> suitable for repository documentation</w:t>
@@ -2224,7 +2350,94 @@
         <w:br w:type="page"/>
       </w:r>
     </w:p>
-    <w:p/>
+    <w:p>
+      <w:proofErr w:type="spellStart"/>
+      <w:r>
+        <w:lastRenderedPageBreak/>
+        <w:t>prices_stage</w:t>
+      </w:r>
+      <w:proofErr w:type="spellEnd"/>
+    </w:p>
+    <w:p>
+      <w:r>
+        <w:t xml:space="preserve">    ↓</w:t>
+      </w:r>
+    </w:p>
+    <w:p>
+      <w:proofErr w:type="spellStart"/>
+      <w:r>
+        <w:t>prices_clean</w:t>
+      </w:r>
+      <w:proofErr w:type="spellEnd"/>
+    </w:p>
+    <w:p>
+      <w:r>
+        <w:t xml:space="preserve">    ↓</w:t>
+      </w:r>
+    </w:p>
+    <w:p>
+      <w:proofErr w:type="spellStart"/>
+      <w:r>
+        <w:t>returns_</w:t>
+      </w:r>
+      <w:proofErr w:type="gramStart"/>
+      <w:r>
+        <w:t>daily</w:t>
+      </w:r>
+      <w:proofErr w:type="spellEnd"/>
+      <w:r>
+        <w:t xml:space="preserve">  →</w:t>
+      </w:r>
+      <w:proofErr w:type="gramEnd"/>
+      <w:r>
+        <w:t xml:space="preserve">  </w:t>
+      </w:r>
+      <w:proofErr w:type="spellStart"/>
+      <w:r>
+        <w:t>forward_returns</w:t>
+      </w:r>
+      <w:proofErr w:type="spellEnd"/>
+    </w:p>
+    <w:p>
+      <w:r>
+        <w:t xml:space="preserve">    ↓                 ↓</w:t>
+      </w:r>
+    </w:p>
+    <w:p>
+      <w:r>
+        <w:t xml:space="preserve">    signals      →   </w:t>
+      </w:r>
+      <w:proofErr w:type="spellStart"/>
+      <w:r>
+        <w:t>strategy_positions</w:t>
+      </w:r>
+      <w:proofErr w:type="spellEnd"/>
+    </w:p>
+    <w:p>
+      <w:r>
+        <w:t xml:space="preserve">                          ↓</w:t>
+      </w:r>
+    </w:p>
+    <w:p>
+      <w:r>
+        <w:t xml:space="preserve">                    </w:t>
+      </w:r>
+      <w:proofErr w:type="spellStart"/>
+      <w:r>
+        <w:t>strategy_performance</w:t>
+      </w:r>
+      <w:proofErr w:type="spellEnd"/>
+    </w:p>
+    <w:p>
+      <w:r>
+        <w:t xml:space="preserve">                          ↓</w:t>
+      </w:r>
+    </w:p>
+    <w:p>
+      <w:r>
+        <w:t xml:space="preserve">                        dashboard</w:t>
+      </w:r>
+    </w:p>
     <w:sectPr>
       <w:pgSz w:w="12240" w:h="15840"/>
       <w:pgMar w:top="1440" w:right="1440" w:bottom="1440" w:left="1440" w:header="708" w:footer="708" w:gutter="0"/>
@@ -4515,6 +4728,7 @@
   <w:style w:type="character" w:default="1" w:styleId="DefaultParagraphFont">
     <w:name w:val="Default Paragraph Font"/>
     <w:uiPriority w:val="1"/>
+    <w:semiHidden/>
     <w:unhideWhenUsed/>
   </w:style>
   <w:style w:type="table" w:default="1" w:styleId="TableNormal">

</xml_diff>